<commit_message>
fix(fixtures): use realistic late-2026 prices
Tehran courier delivery is now 200,000 Toman (owner-specified) and every
other amount in the shop and library fixtures is scaled to a plausible,
internally consistent level (free-shipping threshold, loyalty points, COD and
instalment limits, installation fees, gift cards, seller payouts, catalog
prices, membership, fines, print, workshops, annual budget). Only the
amounts change; wording, structure and deliberate digit/letter messiness are
kept. Questions, answers, evidence spans, the regenerated catalog PDF and
installation DOCX, and the lesson snippets quoting the courier price follow.
</commit_message>
<xml_diff>
--- a/data/fixtures/documents/kahroba-installation-guide.docx
+++ b/data/fixtures/documents/kahroba-installation-guide.docx
@@ -150,7 +150,7 @@
               <w:rPr>
                 <w:rtl/>
               </w:rPr>
-              <w:t xml:space="preserve">۹۰۰ هزار تومان</w:t>
+              <w:t xml:space="preserve">۴ میلیون تومان</w:t>
             </w:r>
           </w:p>
         </w:tc>
@@ -182,7 +182,7 @@
               <w:rPr>
                 <w:rtl/>
               </w:rPr>
-              <w:t xml:space="preserve">۱٫۲ میلیون تومان</w:t>
+              <w:t xml:space="preserve">۵٫۲ میلیون تومان</w:t>
             </w:r>
           </w:p>
         </w:tc>
@@ -214,7 +214,7 @@
               <w:rPr>
                 <w:rtl/>
               </w:rPr>
-              <w:t xml:space="preserve">۱٫۵ میلیون تومان</w:t>
+              <w:t xml:space="preserve">۶٫۵ میلیون تومان</w:t>
             </w:r>
           </w:p>
         </w:tc>

</xml_diff>